<commit_message>
Minor fixes to CVs
</commit_message>
<xml_diff>
--- a/hhassan_LLM.docx
+++ b/hhassan_LLM.docx
@@ -148,6 +148,7 @@
       <w:r>
         <w:rPr>
           <w:rFonts w:ascii="Georgia" w:eastAsia="Merriweather Light" w:hAnsi="Georgia" w:cs="Merriweather Light"/>
+          <w:noProof/>
           <w:color w:val="000000" w:themeColor="text1"/>
           <w:sz w:val="18"/>
           <w:szCs w:val="18"/>
@@ -225,6 +226,7 @@
       <w:r>
         <w:rPr>
           <w:rFonts w:ascii="Georgia" w:eastAsia="Merriweather Light" w:hAnsi="Georgia" w:cs="Merriweather Light"/>
+          <w:noProof/>
           <w:color w:val="000000" w:themeColor="text1"/>
           <w:sz w:val="18"/>
           <w:szCs w:val="18"/>
@@ -352,6 +354,7 @@
       <w:r>
         <w:rPr>
           <w:rFonts w:ascii="Georgia" w:eastAsia="Merriweather Light" w:hAnsi="Georgia" w:cs="Merriweather Light"/>
+          <w:noProof/>
           <w:color w:val="000000" w:themeColor="text1"/>
           <w:sz w:val="18"/>
           <w:szCs w:val="18"/>
@@ -429,6 +432,7 @@
       <w:r>
         <w:rPr>
           <w:rFonts w:ascii="Georgia" w:eastAsia="Merriweather Light" w:hAnsi="Georgia" w:cs="Merriweather Light"/>
+          <w:noProof/>
           <w:color w:val="000000" w:themeColor="text1"/>
           <w:sz w:val="18"/>
           <w:szCs w:val="18"/>
@@ -1181,26 +1185,16 @@
         <w:spacing w:after="0" w:line="270" w:lineRule="auto"/>
         <w:rPr>
           <w:color w:val="000000" w:themeColor="text1"/>
-          <w:sz w:val="16"/>
-          <w:szCs w:val="16"/>
-        </w:rPr>
-      </w:pPr>
-      <w:r>
-        <w:rPr>
-          <w:color w:val="000000" w:themeColor="text1"/>
-          <w:sz w:val="16"/>
-          <w:szCs w:val="16"/>
-        </w:rPr>
-        <w:t>Prototyped an agentic AI call-center assistant: LLM tool-calling + Multi-RAG for intent handling and answer generation with CRM/ticketing actions, guardrails, human-in-the-loop escalation, and an output-quality evaluation loop.</w:t>
-      </w:r>
-    </w:p>
-    <w:p>
-      <w:pPr>
-        <w:spacing w:after="0" w:line="160" w:lineRule="auto"/>
-        <w:rPr>
-          <w:color w:val="000000" w:themeColor="text1"/>
-        </w:rPr>
-      </w:pPr>
+        </w:rPr>
+      </w:pPr>
+      <w:r>
+        <w:rPr>
+          <w:color w:val="000000" w:themeColor="text1"/>
+          <w:sz w:val="16"/>
+          <w:szCs w:val="16"/>
+        </w:rPr>
+        <w:t>Built Multi-RAG pipelines (multi-source retrieval, hybrid search, reranking), improving Recall@10 ~20% and reducing hallucinations ~30%.</w:t>
+      </w:r>
     </w:p>
     <w:p>
       <w:pPr>
@@ -1508,6 +1502,7 @@
           <w:color w:val="000000" w:themeColor="text1"/>
           <w:lang w:val="en-US"/>
         </w:rPr>
+        <w:lastRenderedPageBreak/>
         <w:t>Senior ML Engineer (Computer Vision)</w:t>
       </w:r>
     </w:p>

</xml_diff>